<commit_message>
Add bilingual (English) title, abstract and keywords for journal submission
Co-authored-by: surfatheart <22271710+surfatheart@users.noreply.github.com>
</commit_message>
<xml_diff>
--- a/大语言模型在中医药领域评测研究_投稿润色版.docx
+++ b/大语言模型在中医药领域评测研究_投稿润色版.docx
@@ -54,6 +54,63 @@
           <w:sz w:val="21"/>
         </w:rPr>
         <w:t>大语言模型；中医药；评测研究；临床推理；多模态</w:t>
+      </w:r>
+    </w:p>
+    <w:p>
+      <w:pPr>
+        <w:ind w:firstLine="420"/>
+        <w:jc w:val="center"/>
+      </w:pPr>
+      <w:r/>
+      <w:r>
+        <w:rPr>
+          <w:rFonts w:ascii="Times New Roman" w:hAnsi="Times New Roman" w:eastAsia="SimSun"/>
+          <w:b/>
+          <w:sz w:val="26"/>
+        </w:rPr>
+        <w:t>Evaluation of Large Language Models in Traditional Chinese Medicine: Benchmark Construction, Capability Assessment and Future Directions</w:t>
+      </w:r>
+    </w:p>
+    <w:p>
+      <w:pPr>
+        <w:ind w:firstLine="420"/>
+      </w:pPr>
+      <w:r/>
+      <w:r>
+        <w:rPr>
+          <w:rFonts w:ascii="Times New Roman" w:hAnsi="Times New Roman" w:eastAsia="SimSun"/>
+          <w:b/>
+          <w:sz w:val="21"/>
+        </w:rPr>
+        <w:t xml:space="preserve">Abstract: </w:t>
+      </w:r>
+      <w:r>
+        <w:rPr>
+          <w:rFonts w:ascii="Times New Roman" w:hAnsi="Times New Roman" w:eastAsia="SimSun"/>
+          <w:sz w:val="21"/>
+        </w:rPr>
+        <w:t>With the expanding application of large language models (LLMs) in healthcare, their evaluation in traditional Chinese medicine (TCM) has become a frontier topic at the intersection of artificial intelligence and medicine. This review searched Web of Science, PubMed, CNKI and Wanfang (search date: 9 June 2026), screened and included relevant studies by preset criteria, and synthesized the literature from three aspects: benchmark construction, capability assessment, and evaluation practice in core scenarios, followed by a methodological reflection on the main limitations of current evaluation systems. The synthesis suggests that benchmarks have extended from standardized examinations to fine-grained capabilities such as syndrome-differentiation reasoning, prescription audit, classical-Chinese understanding and multimodal perception; general-purpose and TCM-specific LLMs each show weaknesses in knowledge recall and clinical reasoning, and cross-study comparability is limited by inconsistent model generations, item types and evaluation protocols; current systems remain dominated by a text-closed assumption and may overestimate real clinical competence in multisensory diagnosis, safety boundaries and real-world utility. On this basis, a TCM-knowledge-driven hierarchical evaluation framework (knowledge-syndrome-treatment principle-formula-efficacy) is proposed, and future directions are discussed regarding multimodal data infrastructure, hierarchical standards, methodological innovation and real-world validation, so as to advance LLMs in TCM from usable toward trustworthy and reliable.</w:t>
+      </w:r>
+    </w:p>
+    <w:p>
+      <w:pPr>
+        <w:ind w:firstLine="420"/>
+      </w:pPr>
+      <w:r/>
+      <w:r>
+        <w:rPr>
+          <w:rFonts w:ascii="Times New Roman" w:hAnsi="Times New Roman" w:eastAsia="SimSun"/>
+          <w:b/>
+          <w:sz w:val="21"/>
+        </w:rPr>
+        <w:t xml:space="preserve">Key words: </w:t>
+      </w:r>
+      <w:r>
+        <w:rPr>
+          <w:rFonts w:ascii="Times New Roman" w:hAnsi="Times New Roman" w:eastAsia="SimSun"/>
+          <w:sz w:val="21"/>
+        </w:rPr>
+        <w:t>Large language models; Traditional Chinese medicine; Evaluation research; Clinical reasoning; Multimodal</w:t>
       </w:r>
     </w:p>
     <w:p>

</xml_diff>